<commit_message>
Refresh CV portfolio content
</commit_message>
<xml_diff>
--- a/public/cv/Ben-Whitfield-Heap-CV.docx
+++ b/public/cv/Ben-Whitfield-Heap-CV.docx
@@ -207,7 +207,7 @@
           <w:color w:val="536467"/>
           <w:sz w:val="16"/>
         </w:rPr>
-        <w:t>Status is part of the description. Product Mole is building / not shipped.</w:t>
+        <w:t>Status is part of the description. Product Mole is live and in use at Kahootz.</w:t>
       </w:r>
     </w:p>
     <w:tbl>
@@ -327,7 +327,7 @@
                 <w:color w:val="0E5E64"/>
                 <w:sz w:val="14"/>
               </w:rPr>
-              <w:t>BUILDING / IN PROGRESS</w:t>
+              <w:t>LIVE / IN USE</w:t>
               <w:br/>
               <w:t>Kahootz AI / product work</w:t>
             </w:r>
@@ -354,7 +354,7 @@
                 <w:color w:val="102A2F"/>
                 <w:sz w:val="18"/>
               </w:rPr>
-              <w:t>A local-first context system for product managers and AI assistants. Building now as part of my Kahootz AI and product work. Not shipped.</w:t>
+              <w:t>A local-first context system for product managers and AI assistants. Live and in use at Kahootz as part of my AI and product work.</w:t>
             </w:r>
           </w:p>
           <w:p>
@@ -399,7 +399,7 @@
                 <w:color w:val="102A2F"/>
                 <w:sz w:val="20"/>
               </w:rPr>
-              <w:t>SourList</w:t>
+              <w:t>Wolds Record</w:t>
             </w:r>
           </w:p>
           <w:p>
@@ -413,9 +413,9 @@
                 <w:color w:val="0E5E64"/>
                 <w:sz w:val="14"/>
               </w:rPr>
-              <w:t>LIVE PRODUCT</w:t>
+              <w:t>LIVE SAAS</w:t>
               <w:br/>
-              <w:t>Small SaaS</w:t>
+              <w:t>WCCRM / AI-built SaaS</w:t>
             </w:r>
           </w:p>
         </w:tc>
@@ -440,7 +440,7 @@
                 <w:color w:val="102A2F"/>
                 <w:sz w:val="18"/>
               </w:rPr>
-              <w:t>A focused SaaS to-do list app and a hands-on experiment in taking a small product from idea to a working service.</w:t>
+              <w:t>The live Wolds Record app, alongside WCCRM, the SaaS product I built solo with AI.</w:t>
             </w:r>
           </w:p>
           <w:p>
@@ -455,7 +455,7 @@
                   <w:sz w:val="16"/>
                   <w:u w:val="single"/>
                 </w:rPr>
-                <w:t>sourlist.com</w:t>
+                <w:t>Open app</w:t>
               </w:r>
             </w:hyperlink>
             <w:r>
@@ -474,112 +474,7 @@
                   <w:sz w:val="16"/>
                   <w:u w:val="single"/>
                 </w:rPr>
-                <w:t>GitHub profile</w:t>
-              </w:r>
-            </w:hyperlink>
-          </w:p>
-        </w:tc>
-      </w:tr>
-      <w:tr>
-        <w:tc>
-          <w:tcPr>
-            <w:tcW w:type="dxa" w:w="2450"/>
-            <w:shd w:fill="E7F1F0" w:val="clear"/>
-            <w:tcMar>
-              <w:top w:w="80" w:type="dxa"/>
-              <w:start w:w="120" w:type="dxa"/>
-              <w:bottom w:w="80" w:type="dxa"/>
-              <w:end w:w="120" w:type="dxa"/>
-            </w:tcMar>
-            <w:vAlign w:val="center"/>
-          </w:tcPr>
-          <w:p>
-            <w:pPr>
-              <w:spacing w:after="60"/>
-            </w:pPr>
-            <w:r>
-              <w:rPr>
-                <w:rFonts w:ascii="Calibri" w:hAnsi="Calibri"/>
-                <w:b/>
-                <w:color w:val="102A2F"/>
-                <w:sz w:val="20"/>
-              </w:rPr>
-              <w:t>Wolds Record</w:t>
-            </w:r>
-          </w:p>
-          <w:p>
-            <w:pPr>
-              <w:spacing w:after="0" w:line="240" w:lineRule="auto"/>
-            </w:pPr>
-            <w:r>
-              <w:rPr>
-                <w:rFonts w:ascii="Consolas" w:hAnsi="Consolas"/>
-                <w:b/>
-                <w:color w:val="0E5E64"/>
-                <w:sz w:val="14"/>
-              </w:rPr>
-              <w:t>PUBLIC REPOS</w:t>
-              <w:br/>
-              <w:t>Content / product systems</w:t>
-            </w:r>
-          </w:p>
-        </w:tc>
-        <w:tc>
-          <w:tcPr>
-            <w:tcW w:type="dxa" w:w="6910"/>
-            <w:tcMar>
-              <w:top w:w="80" w:type="dxa"/>
-              <w:start w:w="120" w:type="dxa"/>
-              <w:bottom w:w="80" w:type="dxa"/>
-              <w:end w:w="120" w:type="dxa"/>
-            </w:tcMar>
-            <w:vAlign w:val="center"/>
-          </w:tcPr>
-          <w:p>
-            <w:pPr>
-              <w:spacing w:after="60"/>
-            </w:pPr>
-            <w:r>
-              <w:rPr>
-                <w:rFonts w:ascii="Calibri" w:hAnsi="Calibri"/>
-                <w:color w:val="102A2F"/>
-                <w:sz w:val="18"/>
-              </w:rPr>
-              <w:t>A set of product and content builds, including a lightweight marketing site and supporting social-media workflow tools.</w:t>
-            </w:r>
-          </w:p>
-          <w:p>
-            <w:pPr>
-              <w:spacing w:after="0"/>
-            </w:pPr>
-            <w:hyperlink r:id="rId16">
-              <w:r>
-                <w:rPr>
-                  <w:rFonts w:ascii="Calibri" w:hAnsi="Calibri"/>
-                  <w:color w:val="0E5E64"/>
-                  <w:sz w:val="16"/>
-                  <w:u w:val="single"/>
-                </w:rPr>
-                <w:t>Marketing repo</w:t>
-              </w:r>
-            </w:hyperlink>
-            <w:r>
-              <w:rPr>
-                <w:rFonts w:ascii="Consolas" w:hAnsi="Consolas"/>
-                <w:color w:val="536467"/>
-                <w:sz w:val="14"/>
-              </w:rPr>
-              <w:t xml:space="preserve">  ·  </w:t>
-            </w:r>
-            <w:hyperlink r:id="rId17">
-              <w:r>
-                <w:rPr>
-                  <w:rFonts w:ascii="Calibri" w:hAnsi="Calibri"/>
-                  <w:color w:val="0E5E64"/>
-                  <w:sz w:val="16"/>
-                  <w:u w:val="single"/>
-                </w:rPr>
-                <w:t>Social studio repo</w:t>
+                <w:t>WCCRM on GitHub</w:t>
               </w:r>
             </w:hyperlink>
           </w:p>
@@ -657,7 +552,7 @@
             <w:pPr>
               <w:spacing w:after="0"/>
             </w:pPr>
-            <w:hyperlink r:id="rId18">
+            <w:hyperlink r:id="rId16">
               <w:r>
                 <w:rPr>
                   <w:rFonts w:ascii="Calibri" w:hAnsi="Calibri"/>
@@ -743,7 +638,7 @@
             <w:pPr>
               <w:spacing w:after="0"/>
             </w:pPr>
-            <w:hyperlink r:id="rId19">
+            <w:hyperlink r:id="rId17">
               <w:r>
                 <w:rPr>
                   <w:rFonts w:ascii="Calibri" w:hAnsi="Calibri"/>
@@ -762,7 +657,198 @@
               </w:rPr>
               <w:t xml:space="preserve">  ·  </w:t>
             </w:r>
+            <w:hyperlink r:id="rId18">
+              <w:r>
+                <w:rPr>
+                  <w:rFonts w:ascii="Calibri" w:hAnsi="Calibri"/>
+                  <w:color w:val="0E5E64"/>
+                  <w:sz w:val="16"/>
+                  <w:u w:val="single"/>
+                </w:rPr>
+                <w:t>GitHub repo</w:t>
+              </w:r>
+            </w:hyperlink>
+          </w:p>
+        </w:tc>
+      </w:tr>
+      <w:tr>
+        <w:tc>
+          <w:tcPr>
+            <w:tcW w:type="dxa" w:w="2450"/>
+            <w:shd w:fill="E7F1F0" w:val="clear"/>
+            <w:tcMar>
+              <w:top w:w="80" w:type="dxa"/>
+              <w:start w:w="120" w:type="dxa"/>
+              <w:bottom w:w="80" w:type="dxa"/>
+              <w:end w:w="120" w:type="dxa"/>
+            </w:tcMar>
+            <w:vAlign w:val="center"/>
+          </w:tcPr>
+          <w:p>
+            <w:pPr>
+              <w:spacing w:after="60"/>
+            </w:pPr>
+            <w:r>
+              <w:rPr>
+                <w:rFonts w:ascii="Calibri" w:hAnsi="Calibri"/>
+                <w:b/>
+                <w:color w:val="102A2F"/>
+                <w:sz w:val="20"/>
+              </w:rPr>
+              <w:t>BWH Agent Toolkit</w:t>
+            </w:r>
+          </w:p>
+          <w:p>
+            <w:pPr>
+              <w:spacing w:after="0" w:line="240" w:lineRule="auto"/>
+            </w:pPr>
+            <w:r>
+              <w:rPr>
+                <w:rFonts w:ascii="Consolas" w:hAnsi="Consolas"/>
+                <w:b/>
+                <w:color w:val="0E5E64"/>
+                <w:sz w:val="14"/>
+              </w:rPr>
+              <w:t>PUBLIC TOOLKIT</w:t>
+              <w:br/>
+              <w:t>Open-source agent skills</w:t>
+            </w:r>
+          </w:p>
+        </w:tc>
+        <w:tc>
+          <w:tcPr>
+            <w:tcW w:type="dxa" w:w="6910"/>
+            <w:tcMar>
+              <w:top w:w="80" w:type="dxa"/>
+              <w:start w:w="120" w:type="dxa"/>
+              <w:bottom w:w="80" w:type="dxa"/>
+              <w:end w:w="120" w:type="dxa"/>
+            </w:tcMar>
+            <w:vAlign w:val="center"/>
+          </w:tcPr>
+          <w:p>
+            <w:pPr>
+              <w:spacing w:after="60"/>
+            </w:pPr>
+            <w:r>
+              <w:rPr>
+                <w:rFonts w:ascii="Calibri" w:hAnsi="Calibri"/>
+                <w:color w:val="102A2F"/>
+                <w:sz w:val="18"/>
+              </w:rPr>
+              <w:t>A portable collection of agent skills for product discovery, specification, software delivery, engineering analysis, verification, and technical writing.</w:t>
+            </w:r>
+          </w:p>
+          <w:p>
+            <w:pPr>
+              <w:spacing w:after="0"/>
+            </w:pPr>
+            <w:hyperlink r:id="rId19">
+              <w:r>
+                <w:rPr>
+                  <w:rFonts w:ascii="Calibri" w:hAnsi="Calibri"/>
+                  <w:color w:val="0E5E64"/>
+                  <w:sz w:val="16"/>
+                  <w:u w:val="single"/>
+                </w:rPr>
+                <w:t>GitHub repo</w:t>
+              </w:r>
+            </w:hyperlink>
+          </w:p>
+        </w:tc>
+      </w:tr>
+      <w:tr>
+        <w:tc>
+          <w:tcPr>
+            <w:tcW w:type="dxa" w:w="2450"/>
+            <w:shd w:fill="E7F1F0" w:val="clear"/>
+            <w:tcMar>
+              <w:top w:w="80" w:type="dxa"/>
+              <w:start w:w="120" w:type="dxa"/>
+              <w:bottom w:w="80" w:type="dxa"/>
+              <w:end w:w="120" w:type="dxa"/>
+            </w:tcMar>
+            <w:vAlign w:val="center"/>
+          </w:tcPr>
+          <w:p>
+            <w:pPr>
+              <w:spacing w:after="60"/>
+            </w:pPr>
+            <w:r>
+              <w:rPr>
+                <w:rFonts w:ascii="Calibri" w:hAnsi="Calibri"/>
+                <w:b/>
+                <w:color w:val="102A2F"/>
+                <w:sz w:val="20"/>
+              </w:rPr>
+              <w:t>BenOS</w:t>
+            </w:r>
+          </w:p>
+          <w:p>
+            <w:pPr>
+              <w:spacing w:after="0" w:line="240" w:lineRule="auto"/>
+            </w:pPr>
+            <w:r>
+              <w:rPr>
+                <w:rFonts w:ascii="Consolas" w:hAnsi="Consolas"/>
+                <w:b/>
+                <w:color w:val="0E5E64"/>
+                <w:sz w:val="14"/>
+              </w:rPr>
+              <w:t>PUBLIC PROJECT</w:t>
+              <w:br/>
+              <w:t>Local-first micro-apps</w:t>
+            </w:r>
+          </w:p>
+        </w:tc>
+        <w:tc>
+          <w:tcPr>
+            <w:tcW w:type="dxa" w:w="6910"/>
+            <w:tcMar>
+              <w:top w:w="80" w:type="dxa"/>
+              <w:start w:w="120" w:type="dxa"/>
+              <w:bottom w:w="80" w:type="dxa"/>
+              <w:end w:w="120" w:type="dxa"/>
+            </w:tcMar>
+            <w:vAlign w:val="center"/>
+          </w:tcPr>
+          <w:p>
+            <w:pPr>
+              <w:spacing w:after="60"/>
+            </w:pPr>
+            <w:r>
+              <w:rPr>
+                <w:rFonts w:ascii="Calibri" w:hAnsi="Calibri"/>
+                <w:color w:val="102A2F"/>
+                <w:sz w:val="18"/>
+              </w:rPr>
+              <w:t>A local-first collection of tiny personal micro-apps. Browser-only tools with no accounts, sync, or cloud.</w:t>
+            </w:r>
+          </w:p>
+          <w:p>
+            <w:pPr>
+              <w:spacing w:after="0"/>
+            </w:pPr>
             <w:hyperlink r:id="rId20">
+              <w:r>
+                <w:rPr>
+                  <w:rFonts w:ascii="Calibri" w:hAnsi="Calibri"/>
+                  <w:color w:val="0E5E64"/>
+                  <w:sz w:val="16"/>
+                  <w:u w:val="single"/>
+                </w:rPr>
+                <w:t>Open BenOS</w:t>
+              </w:r>
+            </w:hyperlink>
+            <w:r>
+              <w:rPr>
+                <w:rFonts w:ascii="Consolas" w:hAnsi="Consolas"/>
+                <w:color w:val="536467"/>
+                <w:sz w:val="14"/>
+              </w:rPr>
+              <w:t xml:space="preserve">  ·  </w:t>
+            </w:r>
+            <w:hyperlink r:id="rId21">
               <w:r>
                 <w:rPr>
                   <w:rFonts w:ascii="Calibri" w:hAnsi="Calibri"/>
@@ -848,7 +934,7 @@
             <w:pPr>
               <w:spacing w:after="0"/>
             </w:pPr>
-            <w:hyperlink r:id="rId21">
+            <w:hyperlink r:id="rId22">
               <w:r>
                 <w:rPr>
                   <w:rFonts w:ascii="Calibri" w:hAnsi="Calibri"/>
@@ -867,7 +953,7 @@
               </w:rPr>
               <w:t xml:space="preserve">  ·  </w:t>
             </w:r>
-            <w:hyperlink r:id="rId22">
+            <w:hyperlink r:id="rId23">
               <w:r>
                 <w:rPr>
                   <w:rFonts w:ascii="Calibri" w:hAnsi="Calibri"/>
@@ -1044,7 +1130,41 @@
           <w:color w:val="102A2F"/>
           <w:sz w:val="19"/>
         </w:rPr>
-        <w:t>Building Product Mole, a local, privacy-conscious AI insight-synthesis and measurement workflow. In progress, not shipped.</w:t>
+        <w:t>Product Mole is live and in use at Kahootz as part of my AI and product work.</w:t>
+      </w:r>
+    </w:p>
+    <w:p>
+      <w:pPr>
+        <w:pStyle w:val="CVBullet"/>
+        <w:numPr>
+          <w:ilvl w:val="0"/>
+          <w:numId w:val="10"/>
+        </w:numPr>
+      </w:pPr>
+      <w:r>
+        <w:rPr>
+          <w:rFonts w:ascii="Calibri" w:hAnsi="Calibri"/>
+          <w:color w:val="102A2F"/>
+          <w:sz w:val="19"/>
+        </w:rPr>
+        <w:t>Oversee support and security alongside product, including ISMS management and ISO 27001 and Cyber Essentials compliance.</w:t>
+      </w:r>
+    </w:p>
+    <w:p>
+      <w:pPr>
+        <w:pStyle w:val="CVBullet"/>
+        <w:numPr>
+          <w:ilvl w:val="0"/>
+          <w:numId w:val="10"/>
+        </w:numPr>
+      </w:pPr>
+      <w:r>
+        <w:rPr>
+          <w:rFonts w:ascii="Calibri" w:hAnsi="Calibri"/>
+          <w:color w:val="102A2F"/>
+          <w:sz w:val="19"/>
+        </w:rPr>
+        <w:t>Member of the Senior Leadership Team, contributing to company-level priorities beyond product.</w:t>
       </w:r>
     </w:p>
     <w:p>
@@ -1361,6 +1481,17 @@
         <w:pStyle w:val="CVContext"/>
         <w:keepNext w:val="1"/>
       </w:pPr>
+      <w:hyperlink r:id="rId24">
+        <w:r>
+          <w:rPr>
+            <w:rFonts w:ascii="Calibri" w:hAnsi="Calibri"/>
+            <w:color w:val="0E5E64"/>
+            <w:sz w:val="19"/>
+            <w:u w:val="single"/>
+          </w:rPr>
+          <w:t>NHS Futures</w:t>
+        </w:r>
+      </w:hyperlink>
       <w:r>
         <w:rPr>
           <w:rFonts w:ascii="Calibri" w:hAnsi="Calibri"/>
@@ -1368,7 +1499,7 @@
           <w:color w:val="536467"/>
           <w:sz w:val="18"/>
         </w:rPr>
-        <w:t>FutureNHS collaboration platform and Local Health and Care Records programme</w:t>
+        <w:t xml:space="preserve"> (formerly FutureNHS) collaboration platform and Local Health and Care Records programme</w:t>
       </w:r>
     </w:p>
     <w:p>
@@ -1385,7 +1516,7 @@
           <w:color w:val="102A2F"/>
           <w:sz w:val="19"/>
         </w:rPr>
-        <w:t>Scaled FutureNHS from 8,000 to more than 50,000 monthly active users in three years by defining product vision and growth strategy for an enterprise collaboration service used across the health and care sector.</w:t>
+        <w:t>Scaled the FutureNHS collaboration service, now NHS Futures, from 8,000 to more than 50,000 monthly active users in three years by defining product vision and growth strategy for an enterprise collaboration service used across the health and care sector.</w:t>
       </w:r>
     </w:p>
     <w:p>

</xml_diff>